<commit_message>
supprimé les fichiers inutiles
</commit_message>
<xml_diff>
--- a/Maquettes_4_Facultes_Theologie_Informatique_Economie_Education.docx
+++ b/Maquettes_4_Facultes_Theologie_Informatique_Economie_Education.docx
@@ -6,21 +6,34 @@
       <w:pPr>
         <w:pStyle w:val="Titre2"/>
       </w:pPr>
-      <w:bookmarkStart w:id="0" w:name="X9c47c45b940c16aa411da24f2cdf659cc70241a"/>
-      <w:bookmarkStart w:id="1" w:name="X0fc41fcd37dcaff9c5e37ef08aeeb6e2b295d76"/>
-      <w:bookmarkStart w:id="2" w:name="_Toc234848685"/>
+      <w:bookmarkStart w:id="0" w:name="_Toc234848685"/>
+      <w:bookmarkStart w:id="1" w:name="X9c47c45b940c16aa411da24f2cdf659cc70241a"/>
+      <w:bookmarkStart w:id="2" w:name="X0fc41fcd37dcaff9c5e37ef08aeeb6e2b295d76"/>
       <w:r>
         <w:t xml:space="preserve">Compilation pour 4 </w:t>
       </w:r>
       <w:proofErr w:type="spellStart"/>
+      <w:proofErr w:type="gramStart"/>
       <w:r>
         <w:t>facultés</w:t>
       </w:r>
       <w:proofErr w:type="spellEnd"/>
       <w:r>
-        <w:t xml:space="preserve"> : Théologie, Sciences Informatiques, Sciences Économiques &amp; Gestion, Sciences de l’Éducation &amp; Psychologie</w:t>
+        <w:t xml:space="preserve"> :</w:t>
       </w:r>
-      <w:bookmarkEnd w:id="2"/>
+      <w:proofErr w:type="gramEnd"/>
+      <w:r>
+        <w:t xml:space="preserve"> </w:t>
+      </w:r>
+      <w:proofErr w:type="spellStart"/>
+      <w:r>
+        <w:t>Théologie</w:t>
+      </w:r>
+      <w:proofErr w:type="spellEnd"/>
+      <w:r>
+        <w:t>, Sciences Informatiques, Sciences Économiques &amp; Gestion, Sciences de l’Éducation &amp; Psychologie</w:t>
+      </w:r>
+      <w:bookmarkEnd w:id="0"/>
     </w:p>
     <w:p>
       <w:r>
@@ -33,14 +46,14 @@
       <w:pPr>
         <w:pStyle w:val="Titre1"/>
       </w:pPr>
-      <w:bookmarkStart w:id="3" w:name="faculté-de-théologie"/>
-      <w:bookmarkStart w:id="4" w:name="_Toc234848686"/>
-      <w:bookmarkEnd w:id="0"/>
+      <w:bookmarkStart w:id="3" w:name="_Toc234848686"/>
+      <w:bookmarkStart w:id="4" w:name="faculté-de-théologie"/>
       <w:bookmarkEnd w:id="1"/>
+      <w:bookmarkEnd w:id="2"/>
       <w:r>
         <w:t>1. FACULTÉ DE THÉOLOGIE</w:t>
       </w:r>
-      <w:bookmarkEnd w:id="4"/>
+      <w:bookmarkEnd w:id="3"/>
     </w:p>
     <w:p>
       <w:pPr>
@@ -58,12 +71,12 @@
       <w:pPr>
         <w:pStyle w:val="Titre2"/>
       </w:pPr>
-      <w:bookmarkStart w:id="5" w:name="X8122d5e99564e01ffcba8fc1cffcebda05321e5"/>
-      <w:bookmarkStart w:id="6" w:name="_Toc234848687"/>
+      <w:bookmarkStart w:id="5" w:name="_Toc234848687"/>
+      <w:bookmarkStart w:id="6" w:name="X8122d5e99564e01ffcba8fc1cffcebda05321e5"/>
       <w:r>
         <w:t>1.1 LICENCE EN THÉOLOGIE (LT) — Mention « Théologie »</w:t>
       </w:r>
-      <w:bookmarkEnd w:id="6"/>
+      <w:bookmarkEnd w:id="5"/>
     </w:p>
     <w:p>
       <w:pPr>
@@ -287,7 +300,15 @@
               <w:pStyle w:val="Compact"/>
             </w:pPr>
             <w:r>
-              <w:t>Grec 1 : Grammaire et Syntaxe</w:t>
+              <w:t xml:space="preserve">Grec </w:t>
+            </w:r>
+            <w:proofErr w:type="gramStart"/>
+            <w:r>
+              <w:t>1 :</w:t>
+            </w:r>
+            <w:proofErr w:type="gramEnd"/>
+            <w:r>
+              <w:t xml:space="preserve"> Grammaire et Syntaxe</w:t>
             </w:r>
           </w:p>
         </w:tc>
@@ -687,7 +708,23 @@
               <w:pStyle w:val="Compact"/>
             </w:pPr>
             <w:r>
-              <w:t>Langues et expression : Expr. orale/écrite, Anglais : lecture textes théologiques</w:t>
+              <w:t xml:space="preserve">Langues et </w:t>
+            </w:r>
+            <w:proofErr w:type="gramStart"/>
+            <w:r>
+              <w:t>expression :</w:t>
+            </w:r>
+            <w:proofErr w:type="gramEnd"/>
+            <w:r>
+              <w:t xml:space="preserve"> Expr. orale/écrite, </w:t>
+            </w:r>
+            <w:proofErr w:type="gramStart"/>
+            <w:r>
+              <w:t>Anglais :</w:t>
+            </w:r>
+            <w:proofErr w:type="gramEnd"/>
+            <w:r>
+              <w:t xml:space="preserve"> lecture textes théologiques</w:t>
             </w:r>
           </w:p>
         </w:tc>
@@ -1112,7 +1149,15 @@
               <w:pStyle w:val="Compact"/>
             </w:pPr>
             <w:r>
-              <w:t>Monde de la Bible 1 (Intro. AT, Géographie Palestine) / Monde de la Bible 2 : Critique textuelle</w:t>
+              <w:t xml:space="preserve">Monde de la Bible 1 (Intro. AT, Géographie Palestine) / Monde de la Bible </w:t>
+            </w:r>
+            <w:proofErr w:type="gramStart"/>
+            <w:r>
+              <w:t>2 :</w:t>
+            </w:r>
+            <w:proofErr w:type="gramEnd"/>
+            <w:r>
+              <w:t xml:space="preserve"> Critique textuelle</w:t>
             </w:r>
           </w:p>
         </w:tc>
@@ -1192,7 +1237,15 @@
               <w:pStyle w:val="Compact"/>
             </w:pPr>
             <w:r>
-              <w:t>Monde de la Bible 1 : Introduction au NT / Monde de la Bible 2</w:t>
+              <w:t xml:space="preserve">Monde de la Bible </w:t>
+            </w:r>
+            <w:proofErr w:type="gramStart"/>
+            <w:r>
+              <w:t>1 :</w:t>
+            </w:r>
+            <w:proofErr w:type="gramEnd"/>
+            <w:r>
+              <w:t xml:space="preserve"> Introduction au NT / Monde de la Bible 2</w:t>
             </w:r>
           </w:p>
         </w:tc>
@@ -1432,7 +1485,15 @@
               <w:pStyle w:val="Compact"/>
             </w:pPr>
             <w:r>
-              <w:t>Grec 1 : Lecture et Analyse</w:t>
+              <w:t xml:space="preserve">Grec </w:t>
+            </w:r>
+            <w:proofErr w:type="gramStart"/>
+            <w:r>
+              <w:t>1 :</w:t>
+            </w:r>
+            <w:proofErr w:type="gramEnd"/>
+            <w:r>
+              <w:t xml:space="preserve"> Lecture et Analyse</w:t>
             </w:r>
           </w:p>
         </w:tc>
@@ -1801,7 +1862,15 @@
               <w:pStyle w:val="Compact"/>
             </w:pPr>
             <w:r>
-              <w:t>Grec 2 : Grammaire et Syntaxe</w:t>
+              <w:t xml:space="preserve">Grec </w:t>
+            </w:r>
+            <w:proofErr w:type="gramStart"/>
+            <w:r>
+              <w:t>2 :</w:t>
+            </w:r>
+            <w:proofErr w:type="gramEnd"/>
+            <w:r>
+              <w:t xml:space="preserve"> Grammaire et Syntaxe</w:t>
             </w:r>
           </w:p>
         </w:tc>
@@ -2040,8 +2109,13 @@
             <w:pPr>
               <w:pStyle w:val="Compact"/>
             </w:pPr>
-            <w:r>
-              <w:t>Dogmatique : Trinité, Dieu et Création</w:t>
+            <w:proofErr w:type="gramStart"/>
+            <w:r>
+              <w:t>Dogmatique :</w:t>
+            </w:r>
+            <w:proofErr w:type="gramEnd"/>
+            <w:r>
+              <w:t xml:space="preserve"> Trinité, Dieu et Création</w:t>
             </w:r>
           </w:p>
         </w:tc>
@@ -2545,8 +2619,13 @@
             <w:pPr>
               <w:pStyle w:val="Compact"/>
             </w:pPr>
-            <w:r>
-              <w:t>Exégèse : Méthodes (AT) 1</w:t>
+            <w:proofErr w:type="gramStart"/>
+            <w:r>
+              <w:t>Exégèse :</w:t>
+            </w:r>
+            <w:proofErr w:type="gramEnd"/>
+            <w:r>
+              <w:t xml:space="preserve"> Méthodes (AT) 1</w:t>
             </w:r>
           </w:p>
         </w:tc>
@@ -2626,7 +2705,15 @@
               <w:pStyle w:val="Compact"/>
             </w:pPr>
             <w:r>
-              <w:t>Exégèse 1 : Evangiles synoptiques / Exégèse 2 : Epîtres Catholiques</w:t>
+              <w:t xml:space="preserve">Exégèse </w:t>
+            </w:r>
+            <w:proofErr w:type="gramStart"/>
+            <w:r>
+              <w:t>1 :</w:t>
+            </w:r>
+            <w:proofErr w:type="gramEnd"/>
+            <w:r>
+              <w:t xml:space="preserve"> Evangiles synoptiques / Exégèse 2 : Epîtres Catholiques</w:t>
             </w:r>
           </w:p>
         </w:tc>
@@ -2786,7 +2873,15 @@
               <w:pStyle w:val="Compact"/>
             </w:pPr>
             <w:r>
-              <w:t>Éthique 1 : Biblique, Éthique 2 : Sociale et Politique</w:t>
+              <w:t xml:space="preserve">Éthique </w:t>
+            </w:r>
+            <w:proofErr w:type="gramStart"/>
+            <w:r>
+              <w:t>1 :</w:t>
+            </w:r>
+            <w:proofErr w:type="gramEnd"/>
+            <w:r>
+              <w:t xml:space="preserve"> Biblique, Éthique 2 : Sociale et Politique</w:t>
             </w:r>
           </w:p>
         </w:tc>
@@ -3451,7 +3546,15 @@
               <w:pStyle w:val="Compact"/>
             </w:pPr>
             <w:r>
-              <w:t>Grec III : Lecture cursive des Epîtres de Paul</w:t>
+              <w:t xml:space="preserve">Grec </w:t>
+            </w:r>
+            <w:proofErr w:type="gramStart"/>
+            <w:r>
+              <w:t>III :</w:t>
+            </w:r>
+            <w:proofErr w:type="gramEnd"/>
+            <w:r>
+              <w:t xml:space="preserve"> Lecture cursive des Epîtres de Paul</w:t>
             </w:r>
           </w:p>
         </w:tc>
@@ -3610,8 +3713,13 @@
             <w:pPr>
               <w:pStyle w:val="Compact"/>
             </w:pPr>
-            <w:r>
-              <w:t>Dogmatique : Christologie et Pneumatologie</w:t>
+            <w:proofErr w:type="gramStart"/>
+            <w:r>
+              <w:t>Dogmatique :</w:t>
+            </w:r>
+            <w:proofErr w:type="gramEnd"/>
+            <w:r>
+              <w:t xml:space="preserve"> Christologie et Pneumatologie</w:t>
             </w:r>
           </w:p>
         </w:tc>
@@ -4140,7 +4248,15 @@
               <w:pStyle w:val="Compact"/>
             </w:pPr>
             <w:r>
-              <w:t>Monde de la Bible 3 : Histoire d’Israël et traditions liturgiques de l’AT</w:t>
+              <w:t xml:space="preserve">Monde de la Bible </w:t>
+            </w:r>
+            <w:proofErr w:type="gramStart"/>
+            <w:r>
+              <w:t>3 :</w:t>
+            </w:r>
+            <w:proofErr w:type="gramEnd"/>
+            <w:r>
+              <w:t xml:space="preserve"> Histoire d’Israël et traditions liturgiques de l’AT</w:t>
             </w:r>
           </w:p>
         </w:tc>
@@ -4838,14 +4954,14 @@
       <w:pPr>
         <w:pStyle w:val="Titre2"/>
       </w:pPr>
-      <w:bookmarkStart w:id="13" w:name="master-en-théologie-pastorale-mthp"/>
-      <w:bookmarkStart w:id="14" w:name="_Toc234848688"/>
-      <w:bookmarkEnd w:id="5"/>
+      <w:bookmarkStart w:id="13" w:name="_Toc234848688"/>
+      <w:bookmarkStart w:id="14" w:name="master-en-théologie-pastorale-mthp"/>
+      <w:bookmarkEnd w:id="6"/>
       <w:bookmarkEnd w:id="12"/>
       <w:r>
         <w:t>1.2 MASTER EN THÉOLOGIE PASTORALE (MTHP)</w:t>
       </w:r>
-      <w:bookmarkEnd w:id="14"/>
+      <w:bookmarkEnd w:id="13"/>
     </w:p>
     <w:p>
       <w:pPr>
@@ -5057,7 +5173,15 @@
               <w:pStyle w:val="Compact"/>
             </w:pPr>
             <w:r>
-              <w:t>Atelier d’Exégèse et Débats théologiques : Actes et 1 Cor</w:t>
+              <w:t xml:space="preserve">Atelier d’Exégèse et Débats </w:t>
+            </w:r>
+            <w:proofErr w:type="gramStart"/>
+            <w:r>
+              <w:t>théologiques :</w:t>
+            </w:r>
+            <w:proofErr w:type="gramEnd"/>
+            <w:r>
+              <w:t xml:space="preserve"> Actes et 1 Cor</w:t>
             </w:r>
           </w:p>
         </w:tc>
@@ -5802,7 +5926,15 @@
               <w:pStyle w:val="Compact"/>
             </w:pPr>
             <w:r>
-              <w:t>Exégèse thématique (AT 2) : Pouvoir contre-pouvoir</w:t>
+              <w:t>Exégèse thématique (AT 2</w:t>
+            </w:r>
+            <w:proofErr w:type="gramStart"/>
+            <w:r>
+              <w:t>) :</w:t>
+            </w:r>
+            <w:proofErr w:type="gramEnd"/>
+            <w:r>
+              <w:t xml:space="preserve"> Pouvoir contre-pouvoir</w:t>
             </w:r>
           </w:p>
         </w:tc>
@@ -6202,7 +6334,15 @@
               <w:pStyle w:val="Compact"/>
             </w:pPr>
             <w:r>
-              <w:t>Histoire de l’Eglise Missionnaire : AT et NT</w:t>
+              <w:t xml:space="preserve">Histoire de l’Eglise </w:t>
+            </w:r>
+            <w:proofErr w:type="gramStart"/>
+            <w:r>
+              <w:t>Missionnaire :</w:t>
+            </w:r>
+            <w:proofErr w:type="gramEnd"/>
+            <w:r>
+              <w:t xml:space="preserve"> AT et NT</w:t>
             </w:r>
           </w:p>
         </w:tc>
@@ -6438,7 +6578,6 @@
       <w:bookmarkStart w:id="17" w:name="semestre-3-m2"/>
       <w:bookmarkEnd w:id="16"/>
       <w:r>
-        <w:lastRenderedPageBreak/>
         <w:t>Semestre 3 (M2)</w:t>
       </w:r>
     </w:p>
@@ -6550,6 +6689,7 @@
               <w:pStyle w:val="Compact"/>
             </w:pPr>
             <w:r>
+              <w:lastRenderedPageBreak/>
               <w:t>EHO2231</w:t>
             </w:r>
           </w:p>
@@ -6963,7 +7103,15 @@
               <w:pStyle w:val="Compact"/>
             </w:pPr>
             <w:r>
-              <w:t>Mission et Unité : Dialogue Inter-religieux</w:t>
+              <w:t xml:space="preserve">Mission et </w:t>
+            </w:r>
+            <w:proofErr w:type="gramStart"/>
+            <w:r>
+              <w:t>Unité :</w:t>
+            </w:r>
+            <w:proofErr w:type="gramEnd"/>
+            <w:r>
+              <w:t xml:space="preserve"> Dialogue Inter-religieux</w:t>
             </w:r>
           </w:p>
         </w:tc>
@@ -7228,7 +7376,15 @@
               <w:pStyle w:val="Compact"/>
             </w:pPr>
             <w:r>
-              <w:t>Exégèse thématique (AT) 2 : Violence et Paix AT</w:t>
+              <w:t xml:space="preserve">Exégèse thématique (AT) </w:t>
+            </w:r>
+            <w:proofErr w:type="gramStart"/>
+            <w:r>
+              <w:t>2 :</w:t>
+            </w:r>
+            <w:proofErr w:type="gramEnd"/>
+            <w:r>
+              <w:t xml:space="preserve"> Violence et Paix AT</w:t>
             </w:r>
           </w:p>
         </w:tc>
@@ -7308,7 +7464,15 @@
               <w:pStyle w:val="Compact"/>
             </w:pPr>
             <w:r>
-              <w:t>Exégèse et homilétique : Lectures des textes du NT</w:t>
+              <w:t xml:space="preserve">Exégèse et </w:t>
+            </w:r>
+            <w:proofErr w:type="gramStart"/>
+            <w:r>
+              <w:t>homilétique :</w:t>
+            </w:r>
+            <w:proofErr w:type="gramEnd"/>
+            <w:r>
+              <w:t xml:space="preserve"> Lectures des textes du NT</w:t>
             </w:r>
           </w:p>
         </w:tc>
@@ -7708,7 +7872,15 @@
               <w:pStyle w:val="Compact"/>
             </w:pPr>
             <w:r>
-              <w:t>Histoire de l’Eglise Missionnaire 2 : Dans le monde</w:t>
+              <w:t xml:space="preserve">Histoire de l’Eglise Missionnaire </w:t>
+            </w:r>
+            <w:proofErr w:type="gramStart"/>
+            <w:r>
+              <w:t>2 :</w:t>
+            </w:r>
+            <w:proofErr w:type="gramEnd"/>
+            <w:r>
+              <w:t xml:space="preserve"> Dans le monde</w:t>
             </w:r>
           </w:p>
         </w:tc>
@@ -7926,14 +8098,22 @@
       <w:pPr>
         <w:pStyle w:val="Titre2"/>
       </w:pPr>
-      <w:bookmarkStart w:id="19" w:name="Xbf03b8003340c0ae4d2b8214b94dd8e0f9a3811"/>
-      <w:bookmarkStart w:id="20" w:name="_Toc234848689"/>
-      <w:bookmarkEnd w:id="13"/>
+      <w:bookmarkStart w:id="19" w:name="_Toc234848689"/>
+      <w:bookmarkStart w:id="20" w:name="Xbf03b8003340c0ae4d2b8214b94dd8e0f9a3811"/>
+      <w:bookmarkEnd w:id="14"/>
       <w:bookmarkEnd w:id="18"/>
       <w:r>
-        <w:t>1.3 MASTER EN EXÉGÈSE ET THÉOLOGIE : ANCIEN TESTAMENT (MET)</w:t>
+        <w:t xml:space="preserve">1.3 MASTER EN EXÉGÈSE ET </w:t>
       </w:r>
-      <w:bookmarkEnd w:id="20"/>
+      <w:proofErr w:type="gramStart"/>
+      <w:r>
+        <w:t>THÉOLOGIE :</w:t>
+      </w:r>
+      <w:proofErr w:type="gramEnd"/>
+      <w:r>
+        <w:t xml:space="preserve"> ANCIEN TESTAMENT (MET)</w:t>
+      </w:r>
+      <w:bookmarkEnd w:id="19"/>
     </w:p>
     <w:p>
       <w:pPr>
@@ -8065,7 +8245,15 @@
               <w:pStyle w:val="Compact"/>
             </w:pPr>
             <w:r>
-              <w:t>Sciences pédagogiques : Informations Psycho-pédagogiques spéciales</w:t>
+              <w:t xml:space="preserve">Sciences </w:t>
+            </w:r>
+            <w:proofErr w:type="gramStart"/>
+            <w:r>
+              <w:t>pédagogiques :</w:t>
+            </w:r>
+            <w:proofErr w:type="gramEnd"/>
+            <w:r>
+              <w:t xml:space="preserve"> Informations Psycho-pédagogiques spéciales</w:t>
             </w:r>
           </w:p>
         </w:tc>
@@ -8809,8 +8997,13 @@
             <w:pPr>
               <w:pStyle w:val="Compact"/>
             </w:pPr>
-            <w:r>
-              <w:t>Exégèse : Africaine AT 1</w:t>
+            <w:proofErr w:type="gramStart"/>
+            <w:r>
+              <w:t>Exégèse :</w:t>
+            </w:r>
+            <w:proofErr w:type="gramEnd"/>
+            <w:r>
+              <w:t xml:space="preserve"> Africaine AT 1</w:t>
             </w:r>
           </w:p>
         </w:tc>
@@ -9117,87 +9310,87 @@
               <w:pStyle w:val="Compact"/>
             </w:pPr>
             <w:r>
+              <w:t>QAT2121</w:t>
+            </w:r>
+          </w:p>
+        </w:tc>
+        <w:tc>
+          <w:tcPr>
+            <w:tcW w:w="0" w:type="auto"/>
+          </w:tcPr>
+          <w:p>
+            <w:pPr>
+              <w:pStyle w:val="Compact"/>
+            </w:pPr>
+            <w:r>
+              <w:t>Questions approfondies en Théologie Pratique</w:t>
+            </w:r>
+          </w:p>
+        </w:tc>
+        <w:tc>
+          <w:tcPr>
+            <w:tcW w:w="0" w:type="auto"/>
+          </w:tcPr>
+          <w:p>
+            <w:pPr>
+              <w:pStyle w:val="Compact"/>
+            </w:pPr>
+            <w:r>
+              <w:t>30h</w:t>
+            </w:r>
+          </w:p>
+        </w:tc>
+        <w:tc>
+          <w:tcPr>
+            <w:tcW w:w="0" w:type="auto"/>
+          </w:tcPr>
+          <w:p>
+            <w:pPr>
+              <w:pStyle w:val="Compact"/>
+            </w:pPr>
+            <w:r>
+              <w:t>15h</w:t>
+            </w:r>
+          </w:p>
+        </w:tc>
+        <w:tc>
+          <w:tcPr>
+            <w:tcW w:w="0" w:type="auto"/>
+          </w:tcPr>
+          <w:p>
+            <w:pPr>
+              <w:pStyle w:val="Compact"/>
+            </w:pPr>
+            <w:r>
+              <w:t>15h</w:t>
+            </w:r>
+          </w:p>
+        </w:tc>
+        <w:tc>
+          <w:tcPr>
+            <w:tcW w:w="0" w:type="auto"/>
+          </w:tcPr>
+          <w:p>
+            <w:pPr>
+              <w:pStyle w:val="Compact"/>
+            </w:pPr>
+            <w:r>
+              <w:t>4</w:t>
+            </w:r>
+          </w:p>
+        </w:tc>
+      </w:tr>
+      <w:tr>
+        <w:tc>
+          <w:tcPr>
+            <w:tcW w:w="0" w:type="auto"/>
+          </w:tcPr>
+          <w:p>
+            <w:pPr>
+              <w:pStyle w:val="Compact"/>
+            </w:pPr>
+            <w:r>
               <w:lastRenderedPageBreak/>
-              <w:t>QAT2121</w:t>
-            </w:r>
-          </w:p>
-        </w:tc>
-        <w:tc>
-          <w:tcPr>
-            <w:tcW w:w="0" w:type="auto"/>
-          </w:tcPr>
-          <w:p>
-            <w:pPr>
-              <w:pStyle w:val="Compact"/>
-            </w:pPr>
-            <w:r>
-              <w:t>Questions approfondies en Théologie Pratique</w:t>
-            </w:r>
-          </w:p>
-        </w:tc>
-        <w:tc>
-          <w:tcPr>
-            <w:tcW w:w="0" w:type="auto"/>
-          </w:tcPr>
-          <w:p>
-            <w:pPr>
-              <w:pStyle w:val="Compact"/>
-            </w:pPr>
-            <w:r>
-              <w:t>30h</w:t>
-            </w:r>
-          </w:p>
-        </w:tc>
-        <w:tc>
-          <w:tcPr>
-            <w:tcW w:w="0" w:type="auto"/>
-          </w:tcPr>
-          <w:p>
-            <w:pPr>
-              <w:pStyle w:val="Compact"/>
-            </w:pPr>
-            <w:r>
-              <w:t>15h</w:t>
-            </w:r>
-          </w:p>
-        </w:tc>
-        <w:tc>
-          <w:tcPr>
-            <w:tcW w:w="0" w:type="auto"/>
-          </w:tcPr>
-          <w:p>
-            <w:pPr>
-              <w:pStyle w:val="Compact"/>
-            </w:pPr>
-            <w:r>
-              <w:t>15h</w:t>
-            </w:r>
-          </w:p>
-        </w:tc>
-        <w:tc>
-          <w:tcPr>
-            <w:tcW w:w="0" w:type="auto"/>
-          </w:tcPr>
-          <w:p>
-            <w:pPr>
-              <w:pStyle w:val="Compact"/>
-            </w:pPr>
-            <w:r>
-              <w:t>4</w:t>
-            </w:r>
-          </w:p>
-        </w:tc>
-      </w:tr>
-      <w:tr>
-        <w:tc>
-          <w:tcPr>
-            <w:tcW w:w="0" w:type="auto"/>
-          </w:tcPr>
-          <w:p>
-            <w:pPr>
-              <w:pStyle w:val="Compact"/>
-            </w:pPr>
-            <w:r>
               <w:t>ESE2121</w:t>
             </w:r>
           </w:p>
@@ -9715,8 +9908,13 @@
             <w:pPr>
               <w:pStyle w:val="Compact"/>
             </w:pPr>
-            <w:r>
-              <w:t>Exégèse : Sémantique AT 2</w:t>
+            <w:proofErr w:type="gramStart"/>
+            <w:r>
+              <w:t>Exégèse :</w:t>
+            </w:r>
+            <w:proofErr w:type="gramEnd"/>
+            <w:r>
+              <w:t xml:space="preserve"> Sémantique AT 2</w:t>
             </w:r>
           </w:p>
         </w:tc>
@@ -9795,8 +9993,13 @@
             <w:pPr>
               <w:pStyle w:val="Compact"/>
             </w:pPr>
-            <w:r>
-              <w:t>Exégèse : Sémantique AT 3</w:t>
+            <w:proofErr w:type="gramStart"/>
+            <w:r>
+              <w:t>Exégèse :</w:t>
+            </w:r>
+            <w:proofErr w:type="gramEnd"/>
+            <w:r>
+              <w:t xml:space="preserve"> Sémantique AT 3</w:t>
             </w:r>
           </w:p>
         </w:tc>
@@ -10140,8 +10343,13 @@
             <w:pPr>
               <w:pStyle w:val="Compact"/>
             </w:pPr>
-            <w:r>
-              <w:t>Exégèse : LXX</w:t>
+            <w:proofErr w:type="gramStart"/>
+            <w:r>
+              <w:t>Exégèse :</w:t>
+            </w:r>
+            <w:proofErr w:type="gramEnd"/>
+            <w:r>
+              <w:t xml:space="preserve"> LXX</w:t>
             </w:r>
           </w:p>
         </w:tc>
@@ -10526,9 +10734,9 @@
           <w:szCs w:val="28"/>
         </w:rPr>
       </w:pPr>
-      <w:bookmarkStart w:id="25" w:name="X09707f2d3dbed403b0e31e00370db2a61f661ac"/>
-      <w:bookmarkStart w:id="26" w:name="_Toc234848690"/>
-      <w:bookmarkEnd w:id="19"/>
+      <w:bookmarkStart w:id="25" w:name="_Toc234848690"/>
+      <w:bookmarkStart w:id="26" w:name="X09707f2d3dbed403b0e31e00370db2a61f661ac"/>
+      <w:bookmarkEnd w:id="20"/>
       <w:bookmarkEnd w:id="24"/>
     </w:p>
     <w:p>
@@ -10536,9 +10744,17 @@
         <w:pStyle w:val="Titre2"/>
       </w:pPr>
       <w:r>
-        <w:t>1.4 MASTER EN EXÉGÈSE ET THÉOLOGIE : NOUVEAU TESTAMENT (METN)</w:t>
+        <w:t xml:space="preserve">1.4 MASTER EN EXÉGÈSE ET </w:t>
       </w:r>
-      <w:bookmarkEnd w:id="26"/>
+      <w:proofErr w:type="gramStart"/>
+      <w:r>
+        <w:t>THÉOLOGIE :</w:t>
+      </w:r>
+      <w:proofErr w:type="gramEnd"/>
+      <w:r>
+        <w:t xml:space="preserve"> NOUVEAU TESTAMENT (METN)</w:t>
+      </w:r>
+      <w:bookmarkEnd w:id="25"/>
     </w:p>
     <w:p>
       <w:pPr>
@@ -10842,7 +11058,15 @@
               <w:pStyle w:val="Compact"/>
             </w:pPr>
             <w:r>
-              <w:t>Exégèse et Homilétique : Lecture cursive des textes</w:t>
+              <w:t xml:space="preserve">Exégèse et </w:t>
+            </w:r>
+            <w:proofErr w:type="gramStart"/>
+            <w:r>
+              <w:t>Homilétique :</w:t>
+            </w:r>
+            <w:proofErr w:type="gramEnd"/>
+            <w:r>
+              <w:t xml:space="preserve"> Lecture cursive des textes</w:t>
             </w:r>
           </w:p>
         </w:tc>
@@ -11002,7 +11226,15 @@
               <w:pStyle w:val="Compact"/>
             </w:pPr>
             <w:r>
-              <w:t>Grec du NT et de la LXX : Débats, Traduction, Perspectives</w:t>
+              <w:t xml:space="preserve">Grec du NT et de la </w:t>
+            </w:r>
+            <w:proofErr w:type="gramStart"/>
+            <w:r>
+              <w:t>LXX :</w:t>
+            </w:r>
+            <w:proofErr w:type="gramEnd"/>
+            <w:r>
+              <w:t xml:space="preserve"> Débats, Traduction, Perspectives</w:t>
             </w:r>
           </w:p>
         </w:tc>
@@ -11267,7 +11499,15 @@
               <w:pStyle w:val="Compact"/>
             </w:pPr>
             <w:r>
-              <w:t>Enquêtes exégétiques et herméneutiques : Matthieu, Paul, Jacques</w:t>
+              <w:t xml:space="preserve">Enquêtes exégétiques et </w:t>
+            </w:r>
+            <w:proofErr w:type="gramStart"/>
+            <w:r>
+              <w:t>herméneutiques :</w:t>
+            </w:r>
+            <w:proofErr w:type="gramEnd"/>
+            <w:r>
+              <w:t xml:space="preserve"> Matthieu, Paul, Jacques</w:t>
             </w:r>
           </w:p>
         </w:tc>
@@ -11574,87 +11814,87 @@
               <w:pStyle w:val="Compact"/>
             </w:pPr>
             <w:r>
+              <w:t>QAN2241</w:t>
+            </w:r>
+          </w:p>
+        </w:tc>
+        <w:tc>
+          <w:tcPr>
+            <w:tcW w:w="0" w:type="auto"/>
+          </w:tcPr>
+          <w:p>
+            <w:pPr>
+              <w:pStyle w:val="Compact"/>
+            </w:pPr>
+            <w:r>
+              <w:t>Questions approfondies en NT</w:t>
+            </w:r>
+          </w:p>
+        </w:tc>
+        <w:tc>
+          <w:tcPr>
+            <w:tcW w:w="0" w:type="auto"/>
+          </w:tcPr>
+          <w:p>
+            <w:pPr>
+              <w:pStyle w:val="Compact"/>
+            </w:pPr>
+            <w:r>
+              <w:t>30h</w:t>
+            </w:r>
+          </w:p>
+        </w:tc>
+        <w:tc>
+          <w:tcPr>
+            <w:tcW w:w="0" w:type="auto"/>
+          </w:tcPr>
+          <w:p>
+            <w:pPr>
+              <w:pStyle w:val="Compact"/>
+            </w:pPr>
+            <w:r>
+              <w:t>15h</w:t>
+            </w:r>
+          </w:p>
+        </w:tc>
+        <w:tc>
+          <w:tcPr>
+            <w:tcW w:w="0" w:type="auto"/>
+          </w:tcPr>
+          <w:p>
+            <w:pPr>
+              <w:pStyle w:val="Compact"/>
+            </w:pPr>
+            <w:r>
+              <w:t>15h</w:t>
+            </w:r>
+          </w:p>
+        </w:tc>
+        <w:tc>
+          <w:tcPr>
+            <w:tcW w:w="0" w:type="auto"/>
+          </w:tcPr>
+          <w:p>
+            <w:pPr>
+              <w:pStyle w:val="Compact"/>
+            </w:pPr>
+            <w:r>
+              <w:t>4</w:t>
+            </w:r>
+          </w:p>
+        </w:tc>
+      </w:tr>
+      <w:tr>
+        <w:tc>
+          <w:tcPr>
+            <w:tcW w:w="0" w:type="auto"/>
+          </w:tcPr>
+          <w:p>
+            <w:pPr>
+              <w:pStyle w:val="Compact"/>
+            </w:pPr>
+            <w:r>
               <w:lastRenderedPageBreak/>
-              <w:t>QAN2241</w:t>
-            </w:r>
-          </w:p>
-        </w:tc>
-        <w:tc>
-          <w:tcPr>
-            <w:tcW w:w="0" w:type="auto"/>
-          </w:tcPr>
-          <w:p>
-            <w:pPr>
-              <w:pStyle w:val="Compact"/>
-            </w:pPr>
-            <w:r>
-              <w:t>Questions approfondies en NT</w:t>
-            </w:r>
-          </w:p>
-        </w:tc>
-        <w:tc>
-          <w:tcPr>
-            <w:tcW w:w="0" w:type="auto"/>
-          </w:tcPr>
-          <w:p>
-            <w:pPr>
-              <w:pStyle w:val="Compact"/>
-            </w:pPr>
-            <w:r>
-              <w:t>30h</w:t>
-            </w:r>
-          </w:p>
-        </w:tc>
-        <w:tc>
-          <w:tcPr>
-            <w:tcW w:w="0" w:type="auto"/>
-          </w:tcPr>
-          <w:p>
-            <w:pPr>
-              <w:pStyle w:val="Compact"/>
-            </w:pPr>
-            <w:r>
-              <w:t>15h</w:t>
-            </w:r>
-          </w:p>
-        </w:tc>
-        <w:tc>
-          <w:tcPr>
-            <w:tcW w:w="0" w:type="auto"/>
-          </w:tcPr>
-          <w:p>
-            <w:pPr>
-              <w:pStyle w:val="Compact"/>
-            </w:pPr>
-            <w:r>
-              <w:t>15h</w:t>
-            </w:r>
-          </w:p>
-        </w:tc>
-        <w:tc>
-          <w:tcPr>
-            <w:tcW w:w="0" w:type="auto"/>
-          </w:tcPr>
-          <w:p>
-            <w:pPr>
-              <w:pStyle w:val="Compact"/>
-            </w:pPr>
-            <w:r>
-              <w:t>4</w:t>
-            </w:r>
-          </w:p>
-        </w:tc>
-      </w:tr>
-      <w:tr>
-        <w:tc>
-          <w:tcPr>
-            <w:tcW w:w="0" w:type="auto"/>
-          </w:tcPr>
-          <w:p>
-            <w:pPr>
-              <w:pStyle w:val="Compact"/>
-            </w:pPr>
-            <w:r>
               <w:t>MNT2241</w:t>
             </w:r>
           </w:p>
@@ -11806,14 +12046,14 @@
       <w:pPr>
         <w:pStyle w:val="Titre2"/>
       </w:pPr>
-      <w:bookmarkStart w:id="29" w:name="X49ecc0c88a3f3ded6a8a77812a0878289c4c6c8"/>
-      <w:bookmarkStart w:id="30" w:name="_Toc234848691"/>
-      <w:bookmarkEnd w:id="25"/>
+      <w:bookmarkStart w:id="29" w:name="_Toc234848691"/>
+      <w:bookmarkStart w:id="30" w:name="X49ecc0c88a3f3ded6a8a77812a0878289c4c6c8"/>
+      <w:bookmarkEnd w:id="26"/>
       <w:bookmarkEnd w:id="28"/>
       <w:r>
         <w:t>1.5 MASTER EN THÉOLOGIE SYSTÉMATIQUE ET ÉTHIQUE (MTSE)</w:t>
       </w:r>
-      <w:bookmarkEnd w:id="30"/>
+      <w:bookmarkEnd w:id="29"/>
     </w:p>
     <w:p>
       <w:pPr>
@@ -13670,14 +13910,14 @@
       <w:pPr>
         <w:pStyle w:val="Titre2"/>
       </w:pPr>
-      <w:bookmarkStart w:id="34" w:name="master-en-histoire-de-léglise-mhe"/>
-      <w:bookmarkStart w:id="35" w:name="_Toc234848692"/>
-      <w:bookmarkEnd w:id="29"/>
+      <w:bookmarkStart w:id="34" w:name="_Toc234848692"/>
+      <w:bookmarkStart w:id="35" w:name="master-en-histoire-de-léglise-mhe"/>
+      <w:bookmarkEnd w:id="30"/>
       <w:bookmarkEnd w:id="33"/>
       <w:r>
         <w:t>1.6 MASTER EN HISTOIRE DE L’ÉGLISE (MHE)</w:t>
       </w:r>
-      <w:bookmarkEnd w:id="35"/>
+      <w:bookmarkEnd w:id="34"/>
     </w:p>
     <w:p>
       <w:pPr>
@@ -13968,87 +14208,87 @@
               <w:pStyle w:val="Compact"/>
             </w:pPr>
             <w:r>
+              <w:t>QMH2121</w:t>
+            </w:r>
+          </w:p>
+        </w:tc>
+        <w:tc>
+          <w:tcPr>
+            <w:tcW w:w="0" w:type="auto"/>
+          </w:tcPr>
+          <w:p>
+            <w:pPr>
+              <w:pStyle w:val="Compact"/>
+            </w:pPr>
+            <w:r>
+              <w:t>Questions des Méthodes en Histoire de l’Eglise</w:t>
+            </w:r>
+          </w:p>
+        </w:tc>
+        <w:tc>
+          <w:tcPr>
+            <w:tcW w:w="0" w:type="auto"/>
+          </w:tcPr>
+          <w:p>
+            <w:pPr>
+              <w:pStyle w:val="Compact"/>
+            </w:pPr>
+            <w:r>
+              <w:t>30h</w:t>
+            </w:r>
+          </w:p>
+        </w:tc>
+        <w:tc>
+          <w:tcPr>
+            <w:tcW w:w="0" w:type="auto"/>
+          </w:tcPr>
+          <w:p>
+            <w:pPr>
+              <w:pStyle w:val="Compact"/>
+            </w:pPr>
+            <w:r>
+              <w:t>15h</w:t>
+            </w:r>
+          </w:p>
+        </w:tc>
+        <w:tc>
+          <w:tcPr>
+            <w:tcW w:w="0" w:type="auto"/>
+          </w:tcPr>
+          <w:p>
+            <w:pPr>
+              <w:pStyle w:val="Compact"/>
+            </w:pPr>
+            <w:r>
+              <w:t>15h</w:t>
+            </w:r>
+          </w:p>
+        </w:tc>
+        <w:tc>
+          <w:tcPr>
+            <w:tcW w:w="0" w:type="auto"/>
+          </w:tcPr>
+          <w:p>
+            <w:pPr>
+              <w:pStyle w:val="Compact"/>
+            </w:pPr>
+            <w:r>
+              <w:t>4</w:t>
+            </w:r>
+          </w:p>
+        </w:tc>
+      </w:tr>
+      <w:tr>
+        <w:tc>
+          <w:tcPr>
+            <w:tcW w:w="0" w:type="auto"/>
+          </w:tcPr>
+          <w:p>
+            <w:pPr>
+              <w:pStyle w:val="Compact"/>
+            </w:pPr>
+            <w:r>
               <w:lastRenderedPageBreak/>
-              <w:t>QMH2121</w:t>
-            </w:r>
-          </w:p>
-        </w:tc>
-        <w:tc>
-          <w:tcPr>
-            <w:tcW w:w="0" w:type="auto"/>
-          </w:tcPr>
-          <w:p>
-            <w:pPr>
-              <w:pStyle w:val="Compact"/>
-            </w:pPr>
-            <w:r>
-              <w:t>Questions des Méthodes en Histoire de l’Eglise</w:t>
-            </w:r>
-          </w:p>
-        </w:tc>
-        <w:tc>
-          <w:tcPr>
-            <w:tcW w:w="0" w:type="auto"/>
-          </w:tcPr>
-          <w:p>
-            <w:pPr>
-              <w:pStyle w:val="Compact"/>
-            </w:pPr>
-            <w:r>
-              <w:t>30h</w:t>
-            </w:r>
-          </w:p>
-        </w:tc>
-        <w:tc>
-          <w:tcPr>
-            <w:tcW w:w="0" w:type="auto"/>
-          </w:tcPr>
-          <w:p>
-            <w:pPr>
-              <w:pStyle w:val="Compact"/>
-            </w:pPr>
-            <w:r>
-              <w:t>15h</w:t>
-            </w:r>
-          </w:p>
-        </w:tc>
-        <w:tc>
-          <w:tcPr>
-            <w:tcW w:w="0" w:type="auto"/>
-          </w:tcPr>
-          <w:p>
-            <w:pPr>
-              <w:pStyle w:val="Compact"/>
-            </w:pPr>
-            <w:r>
-              <w:t>15h</w:t>
-            </w:r>
-          </w:p>
-        </w:tc>
-        <w:tc>
-          <w:tcPr>
-            <w:tcW w:w="0" w:type="auto"/>
-          </w:tcPr>
-          <w:p>
-            <w:pPr>
-              <w:pStyle w:val="Compact"/>
-            </w:pPr>
-            <w:r>
-              <w:t>4</w:t>
-            </w:r>
-          </w:p>
-        </w:tc>
-      </w:tr>
-      <w:tr>
-        <w:tc>
-          <w:tcPr>
-            <w:tcW w:w="0" w:type="auto"/>
-          </w:tcPr>
-          <w:p>
-            <w:pPr>
-              <w:pStyle w:val="Compact"/>
-            </w:pPr>
-            <w:r>
               <w:t>QAS2121</w:t>
             </w:r>
           </w:p>
@@ -14567,7 +14807,15 @@
               <w:pStyle w:val="Compact"/>
             </w:pPr>
             <w:r>
-              <w:t>Séminaire de l’Histoire de l’Eglise 1 : Exégèse Patristique</w:t>
+              <w:t xml:space="preserve">Séminaire de l’Histoire de l’Eglise </w:t>
+            </w:r>
+            <w:proofErr w:type="gramStart"/>
+            <w:r>
+              <w:t>1 :</w:t>
+            </w:r>
+            <w:proofErr w:type="gramEnd"/>
+            <w:r>
+              <w:t xml:space="preserve"> Exégèse Patristique</w:t>
             </w:r>
           </w:p>
         </w:tc>
@@ -15232,7 +15480,15 @@
               <w:pStyle w:val="Compact"/>
             </w:pPr>
             <w:r>
-              <w:t>Séminaire de l’Histoire de l’Eglise 2 : Exégèse Patristique</w:t>
+              <w:t xml:space="preserve">Séminaire de l’Histoire de l’Eglise </w:t>
+            </w:r>
+            <w:proofErr w:type="gramStart"/>
+            <w:r>
+              <w:t>2 :</w:t>
+            </w:r>
+            <w:proofErr w:type="gramEnd"/>
+            <w:r>
+              <w:t xml:space="preserve"> Exégèse Patristique</w:t>
             </w:r>
           </w:p>
         </w:tc>
@@ -15622,14 +15878,14 @@
       <w:pPr>
         <w:pStyle w:val="Titre2"/>
       </w:pPr>
-      <w:bookmarkStart w:id="39" w:name="X2b62a7f5e7164aa82540494209444127ea249ef"/>
-      <w:bookmarkStart w:id="40" w:name="_Toc234848693"/>
-      <w:bookmarkEnd w:id="34"/>
+      <w:bookmarkStart w:id="39" w:name="_Toc234848693"/>
+      <w:bookmarkStart w:id="40" w:name="X2b62a7f5e7164aa82540494209444127ea249ef"/>
+      <w:bookmarkEnd w:id="35"/>
       <w:bookmarkEnd w:id="38"/>
       <w:r>
         <w:t>1.7 MASTER EN SCIENCES DE LA MISSION, ŒCUMÉNISME ET DE LA RELIGION</w:t>
       </w:r>
-      <w:bookmarkEnd w:id="40"/>
+      <w:bookmarkEnd w:id="39"/>
     </w:p>
     <w:p>
       <w:pPr>
@@ -17577,14 +17833,14 @@
       <w:pPr>
         <w:pStyle w:val="Titre2"/>
       </w:pPr>
-      <w:bookmarkStart w:id="44" w:name="master-en-théologie-pratique-mtp"/>
-      <w:bookmarkStart w:id="45" w:name="_Toc234848694"/>
-      <w:bookmarkEnd w:id="39"/>
+      <w:bookmarkStart w:id="44" w:name="_Toc234848694"/>
+      <w:bookmarkStart w:id="45" w:name="master-en-théologie-pratique-mtp"/>
+      <w:bookmarkEnd w:id="40"/>
       <w:bookmarkEnd w:id="43"/>
       <w:r>
         <w:t>1.8 MASTER EN THÉOLOGIE PRATIQUE (MTP)</w:t>
       </w:r>
-      <w:bookmarkEnd w:id="45"/>
+      <w:bookmarkEnd w:id="44"/>
     </w:p>
     <w:p>
       <w:pPr>
@@ -19596,7 +19852,7 @@
     <w:p>
       <w:r>
         <w:pict w14:anchorId="7C782EFA">
-          <v:rect id="_x0000_i1084" style="width:0;height:1.5pt" o:hralign="center" o:hrstd="t" o:hr="t"/>
+          <v:rect id="_x0000_i1026" style="width:0;height:1.5pt" o:hralign="center" o:hrstd="t" o:hr="t"/>
         </w:pict>
       </w:r>
     </w:p>
@@ -19604,15 +19860,15 @@
       <w:pPr>
         <w:pStyle w:val="Titre1"/>
       </w:pPr>
-      <w:bookmarkStart w:id="49" w:name="faculté-sciences-informatiques"/>
-      <w:bookmarkStart w:id="50" w:name="_Toc234848695"/>
-      <w:bookmarkEnd w:id="3"/>
-      <w:bookmarkEnd w:id="44"/>
+      <w:bookmarkStart w:id="49" w:name="_Toc234848695"/>
+      <w:bookmarkStart w:id="50" w:name="faculté-sciences-informatiques"/>
+      <w:bookmarkEnd w:id="4"/>
+      <w:bookmarkEnd w:id="45"/>
       <w:bookmarkEnd w:id="48"/>
       <w:r>
         <w:t>2. FACULTÉ SCIENCES INFORMATIQUES</w:t>
       </w:r>
-      <w:bookmarkEnd w:id="50"/>
+      <w:bookmarkEnd w:id="49"/>
     </w:p>
     <w:p>
       <w:pPr>
@@ -19638,7 +19894,23 @@
           <w:b/>
           <w:bCs/>
         </w:rPr>
-        <w:t>8 semestres (</w:t>
+        <w:t xml:space="preserve">8 </w:t>
+      </w:r>
+      <w:proofErr w:type="spellStart"/>
+      <w:r>
+        <w:rPr>
+          <w:b/>
+          <w:bCs/>
+        </w:rPr>
+        <w:t>semestres</w:t>
+      </w:r>
+      <w:proofErr w:type="spellEnd"/>
+      <w:r>
+        <w:rPr>
+          <w:b/>
+          <w:bCs/>
+        </w:rPr>
+        <w:t xml:space="preserve"> (</w:t>
       </w:r>
       <w:proofErr w:type="spellStart"/>
       <w:r>
@@ -19705,12 +19977,12 @@
       <w:pPr>
         <w:pStyle w:val="Titre2"/>
       </w:pPr>
-      <w:bookmarkStart w:id="51" w:name="X503c0c74c2267652e044676e3adb5d07ef438bd"/>
-      <w:bookmarkStart w:id="52" w:name="_Toc234848696"/>
+      <w:bookmarkStart w:id="51" w:name="_Toc234848696"/>
+      <w:bookmarkStart w:id="52" w:name="X503c0c74c2267652e044676e3adb5d07ef438bd"/>
       <w:r>
         <w:t>2.1 LICENCE EN SCIENCES INFORMATIQUES — Mention Génie Logiciel (LSI)</w:t>
       </w:r>
-      <w:bookmarkEnd w:id="52"/>
+      <w:bookmarkEnd w:id="51"/>
     </w:p>
     <w:p>
       <w:pPr>
@@ -23593,87 +23865,87 @@
               <w:pStyle w:val="Compact"/>
             </w:pPr>
             <w:r>
+              <w:t>LPM1471</w:t>
+            </w:r>
+          </w:p>
+        </w:tc>
+        <w:tc>
+          <w:tcPr>
+            <w:tcW w:w="0" w:type="auto"/>
+          </w:tcPr>
+          <w:p>
+            <w:pPr>
+              <w:pStyle w:val="Compact"/>
+            </w:pPr>
+            <w:r>
+              <w:t>Langage de programmation Mobile</w:t>
+            </w:r>
+          </w:p>
+        </w:tc>
+        <w:tc>
+          <w:tcPr>
+            <w:tcW w:w="0" w:type="auto"/>
+          </w:tcPr>
+          <w:p>
+            <w:pPr>
+              <w:pStyle w:val="Compact"/>
+            </w:pPr>
+            <w:r>
+              <w:t>30h</w:t>
+            </w:r>
+          </w:p>
+        </w:tc>
+        <w:tc>
+          <w:tcPr>
+            <w:tcW w:w="0" w:type="auto"/>
+          </w:tcPr>
+          <w:p>
+            <w:pPr>
+              <w:pStyle w:val="Compact"/>
+            </w:pPr>
+            <w:r>
+              <w:t>15h</w:t>
+            </w:r>
+          </w:p>
+        </w:tc>
+        <w:tc>
+          <w:tcPr>
+            <w:tcW w:w="0" w:type="auto"/>
+          </w:tcPr>
+          <w:p>
+            <w:pPr>
+              <w:pStyle w:val="Compact"/>
+            </w:pPr>
+            <w:r>
+              <w:t>15h</w:t>
+            </w:r>
+          </w:p>
+        </w:tc>
+        <w:tc>
+          <w:tcPr>
+            <w:tcW w:w="0" w:type="auto"/>
+          </w:tcPr>
+          <w:p>
+            <w:pPr>
+              <w:pStyle w:val="Compact"/>
+            </w:pPr>
+            <w:r>
+              <w:t>4</w:t>
+            </w:r>
+          </w:p>
+        </w:tc>
+      </w:tr>
+      <w:tr>
+        <w:tc>
+          <w:tcPr>
+            <w:tcW w:w="0" w:type="auto"/>
+          </w:tcPr>
+          <w:p>
+            <w:pPr>
+              <w:pStyle w:val="Compact"/>
+            </w:pPr>
+            <w:r>
               <w:lastRenderedPageBreak/>
-              <w:t>LPM1471</w:t>
-            </w:r>
-          </w:p>
-        </w:tc>
-        <w:tc>
-          <w:tcPr>
-            <w:tcW w:w="0" w:type="auto"/>
-          </w:tcPr>
-          <w:p>
-            <w:pPr>
-              <w:pStyle w:val="Compact"/>
-            </w:pPr>
-            <w:r>
-              <w:t>Langage de programmation Mobile</w:t>
-            </w:r>
-          </w:p>
-        </w:tc>
-        <w:tc>
-          <w:tcPr>
-            <w:tcW w:w="0" w:type="auto"/>
-          </w:tcPr>
-          <w:p>
-            <w:pPr>
-              <w:pStyle w:val="Compact"/>
-            </w:pPr>
-            <w:r>
-              <w:t>30h</w:t>
-            </w:r>
-          </w:p>
-        </w:tc>
-        <w:tc>
-          <w:tcPr>
-            <w:tcW w:w="0" w:type="auto"/>
-          </w:tcPr>
-          <w:p>
-            <w:pPr>
-              <w:pStyle w:val="Compact"/>
-            </w:pPr>
-            <w:r>
-              <w:t>15h</w:t>
-            </w:r>
-          </w:p>
-        </w:tc>
-        <w:tc>
-          <w:tcPr>
-            <w:tcW w:w="0" w:type="auto"/>
-          </w:tcPr>
-          <w:p>
-            <w:pPr>
-              <w:pStyle w:val="Compact"/>
-            </w:pPr>
-            <w:r>
-              <w:t>15h</w:t>
-            </w:r>
-          </w:p>
-        </w:tc>
-        <w:tc>
-          <w:tcPr>
-            <w:tcW w:w="0" w:type="auto"/>
-          </w:tcPr>
-          <w:p>
-            <w:pPr>
-              <w:pStyle w:val="Compact"/>
-            </w:pPr>
-            <w:r>
-              <w:t>4</w:t>
-            </w:r>
-          </w:p>
-        </w:tc>
-      </w:tr>
-      <w:tr>
-        <w:tc>
-          <w:tcPr>
-            <w:tcW w:w="0" w:type="auto"/>
-          </w:tcPr>
-          <w:p>
-            <w:pPr>
-              <w:pStyle w:val="Compact"/>
-            </w:pPr>
-            <w:r>
               <w:t>GLO1471</w:t>
             </w:r>
           </w:p>
@@ -24810,14 +25082,14 @@
       <w:pPr>
         <w:pStyle w:val="Titre2"/>
       </w:pPr>
-      <w:bookmarkStart w:id="61" w:name="X5e69c958869834c4a522e21a110a0128bed1f57"/>
-      <w:bookmarkStart w:id="62" w:name="_Toc234848697"/>
-      <w:bookmarkEnd w:id="51"/>
+      <w:bookmarkStart w:id="61" w:name="_Toc234848697"/>
+      <w:bookmarkStart w:id="62" w:name="X5e69c958869834c4a522e21a110a0128bed1f57"/>
+      <w:bookmarkEnd w:id="52"/>
       <w:bookmarkEnd w:id="60"/>
       <w:r>
         <w:t>2.2 LICENCE EN SCIENCES INFORMATIQUES — Mention Systèmes Informatiques (LSI)</w:t>
       </w:r>
-      <w:bookmarkEnd w:id="62"/>
+      <w:bookmarkEnd w:id="61"/>
     </w:p>
     <w:p>
       <w:pPr>
@@ -26115,7 +26387,6 @@
               <w:pStyle w:val="Compact"/>
             </w:pPr>
             <w:r>
-              <w:lastRenderedPageBreak/>
               <w:t>SIF1361</w:t>
             </w:r>
           </w:p>
@@ -26200,6 +26471,7 @@
                 <w:b/>
                 <w:bCs/>
               </w:rPr>
+              <w:lastRenderedPageBreak/>
               <w:t>Total S6</w:t>
             </w:r>
           </w:p>
@@ -27024,14 +27296,14 @@
       <w:pPr>
         <w:pStyle w:val="Titre2"/>
       </w:pPr>
-      <w:bookmarkStart w:id="67" w:name="Xbfe28b2c97f471927382bc13ed835505e447af1"/>
-      <w:bookmarkStart w:id="68" w:name="_Toc234848698"/>
-      <w:bookmarkEnd w:id="61"/>
+      <w:bookmarkStart w:id="67" w:name="_Toc234848698"/>
+      <w:bookmarkStart w:id="68" w:name="Xbfe28b2c97f471927382bc13ed835505e447af1"/>
+      <w:bookmarkEnd w:id="62"/>
       <w:bookmarkEnd w:id="66"/>
       <w:r>
         <w:t>2.3 LICENCE EN SCIENCES INFORMATIQUES — Mention Intelligence Artificielle (LSI)</w:t>
       </w:r>
-      <w:bookmarkEnd w:id="68"/>
+      <w:bookmarkEnd w:id="67"/>
     </w:p>
     <w:p>
       <w:pPr>
@@ -28483,7 +28755,6 @@
       <w:bookmarkStart w:id="71" w:name="s7-2"/>
       <w:bookmarkEnd w:id="70"/>
       <w:r>
-        <w:lastRenderedPageBreak/>
         <w:t>S7</w:t>
       </w:r>
     </w:p>
@@ -28595,6 +28866,7 @@
               <w:pStyle w:val="Compact"/>
             </w:pPr>
             <w:r>
+              <w:lastRenderedPageBreak/>
               <w:t>MAL1471</w:t>
             </w:r>
           </w:p>
@@ -29891,14 +30163,14 @@
       <w:pPr>
         <w:pStyle w:val="Titre2"/>
       </w:pPr>
-      <w:bookmarkStart w:id="73" w:name="Xb7a56d3e7d801be6e7df3ec770d0c2ece31d095"/>
-      <w:bookmarkStart w:id="74" w:name="_Toc234848699"/>
-      <w:bookmarkEnd w:id="67"/>
+      <w:bookmarkStart w:id="73" w:name="_Toc234848699"/>
+      <w:bookmarkStart w:id="74" w:name="Xb7a56d3e7d801be6e7df3ec770d0c2ece31d095"/>
+      <w:bookmarkEnd w:id="68"/>
       <w:bookmarkEnd w:id="72"/>
       <w:r>
         <w:t>2.4 MASTER EN SCIENCES INFORMATIQUES (MSI) — Parcours Ingénierie Logiciel</w:t>
       </w:r>
-      <w:bookmarkEnd w:id="74"/>
+      <w:bookmarkEnd w:id="73"/>
     </w:p>
     <w:p>
       <w:pPr>
@@ -31242,7 +31514,6 @@
               <w:pStyle w:val="Compact"/>
             </w:pPr>
             <w:r>
-              <w:lastRenderedPageBreak/>
               <w:t>PIL2121</w:t>
             </w:r>
           </w:p>
@@ -31397,6 +31668,7 @@
       <w:bookmarkStart w:id="77" w:name="s3-m2"/>
       <w:bookmarkEnd w:id="76"/>
       <w:r>
+        <w:lastRenderedPageBreak/>
         <w:t>S3 (M2)</w:t>
       </w:r>
     </w:p>
@@ -32724,14 +32996,14 @@
       <w:pPr>
         <w:pStyle w:val="Titre2"/>
       </w:pPr>
-      <w:bookmarkStart w:id="79" w:name="X5dc0f8a99be59e202d316394c88a1c6f9182dcc"/>
-      <w:bookmarkStart w:id="80" w:name="_Toc234848700"/>
-      <w:bookmarkEnd w:id="73"/>
+      <w:bookmarkStart w:id="79" w:name="_Toc234848700"/>
+      <w:bookmarkStart w:id="80" w:name="X5dc0f8a99be59e202d316394c88a1c6f9182dcc"/>
+      <w:bookmarkEnd w:id="74"/>
       <w:bookmarkEnd w:id="78"/>
       <w:r>
         <w:t>2.5 MASTER EN SCIENCES INFORMATIQUES (MSI) — Parcours Ingénierie Sécurité Informatique (ISI)</w:t>
       </w:r>
-      <w:bookmarkEnd w:id="80"/>
+      <w:bookmarkEnd w:id="79"/>
     </w:p>
     <w:p>
       <w:pPr>
@@ -33767,7 +34039,6 @@
               <w:pStyle w:val="Compact"/>
             </w:pPr>
             <w:r>
-              <w:lastRenderedPageBreak/>
               <w:t>PRR2131</w:t>
             </w:r>
           </w:p>
@@ -34092,6 +34363,7 @@
                 <w:b/>
                 <w:bCs/>
               </w:rPr>
+              <w:lastRenderedPageBreak/>
               <w:t>Total S3</w:t>
             </w:r>
           </w:p>
@@ -34824,14 +35096,14 @@
       <w:pPr>
         <w:pStyle w:val="Titre2"/>
       </w:pPr>
-      <w:bookmarkStart w:id="84" w:name="Xd9beec7e7afead54844b61e82f179ede3ad8eb2"/>
-      <w:bookmarkStart w:id="85" w:name="_Toc234848701"/>
-      <w:bookmarkEnd w:id="79"/>
+      <w:bookmarkStart w:id="84" w:name="_Toc234848701"/>
+      <w:bookmarkStart w:id="85" w:name="Xd9beec7e7afead54844b61e82f179ede3ad8eb2"/>
+      <w:bookmarkEnd w:id="80"/>
       <w:bookmarkEnd w:id="83"/>
       <w:r>
         <w:t>2.6 MASTER EN SCIENCES INFORMATIQUES (MSI) — Parcours Ingénierie en Réseaux et Télécommunication (IRT)</w:t>
       </w:r>
-      <w:bookmarkEnd w:id="85"/>
+      <w:bookmarkEnd w:id="84"/>
     </w:p>
     <w:p>
       <w:pPr>
@@ -36129,7 +36401,6 @@
                 <w:b/>
                 <w:bCs/>
               </w:rPr>
-              <w:lastRenderedPageBreak/>
               <w:t>Total S4</w:t>
             </w:r>
           </w:p>
@@ -36196,7 +36467,7 @@
     <w:p>
       <w:r>
         <w:pict w14:anchorId="29AF1FB0">
-          <v:rect id="_x0000_i1085" style="width:0;height:1.5pt" o:hralign="center" o:hrstd="t" o:hr="t"/>
+          <v:rect id="_x0000_i1027" style="width:0;height:1.5pt" o:hralign="center" o:hrstd="t" o:hr="t"/>
         </w:pict>
       </w:r>
     </w:p>
@@ -36204,15 +36475,15 @@
       <w:pPr>
         <w:pStyle w:val="Titre1"/>
       </w:pPr>
-      <w:bookmarkStart w:id="89" w:name="Xbb0f9b7a4e3544e27446695c081aae18e03fd65"/>
-      <w:bookmarkStart w:id="90" w:name="_Toc234848702"/>
-      <w:bookmarkEnd w:id="49"/>
-      <w:bookmarkEnd w:id="84"/>
+      <w:bookmarkStart w:id="89" w:name="_Toc234848702"/>
+      <w:bookmarkStart w:id="90" w:name="Xbb0f9b7a4e3544e27446695c081aae18e03fd65"/>
+      <w:bookmarkEnd w:id="50"/>
+      <w:bookmarkEnd w:id="85"/>
       <w:bookmarkEnd w:id="88"/>
       <w:r>
         <w:t>3. FACULTÉ SCIENCES ÉCONOMIQUES ET DE GESTION</w:t>
       </w:r>
-      <w:bookmarkEnd w:id="90"/>
+      <w:bookmarkEnd w:id="89"/>
     </w:p>
     <w:p>
       <w:pPr>
@@ -36230,12 +36501,13 @@
       <w:pPr>
         <w:pStyle w:val="Titre2"/>
       </w:pPr>
-      <w:bookmarkStart w:id="91" w:name="licence-en-sciences-économiques-lse"/>
-      <w:bookmarkStart w:id="92" w:name="_Toc234848703"/>
+      <w:bookmarkStart w:id="91" w:name="_Toc234848703"/>
+      <w:bookmarkStart w:id="92" w:name="licence-en-sciences-économiques-lse"/>
       <w:r>
+        <w:lastRenderedPageBreak/>
         <w:t>3.1 LICENCE EN SCIENCES ÉCONOMIQUES (LSE)</w:t>
       </w:r>
-      <w:bookmarkEnd w:id="92"/>
+      <w:bookmarkEnd w:id="91"/>
     </w:p>
     <w:p>
       <w:pPr>
@@ -36246,7 +36518,23 @@
           <w:i/>
           <w:iCs/>
         </w:rPr>
-        <w:t>6 semestres, 180 crédits — colonnes : CM/TD/TP/Total(heures)/Crédit</w:t>
+        <w:t xml:space="preserve">6 semestres, 180 crédits — </w:t>
+      </w:r>
+      <w:proofErr w:type="gramStart"/>
+      <w:r>
+        <w:rPr>
+          <w:i/>
+          <w:iCs/>
+        </w:rPr>
+        <w:t>colonnes :</w:t>
+      </w:r>
+      <w:proofErr w:type="gramEnd"/>
+      <w:r>
+        <w:rPr>
+          <w:i/>
+          <w:iCs/>
+        </w:rPr>
+        <w:t xml:space="preserve"> CM/TD/TP/Total(heures)/Crédit</w:t>
       </w:r>
     </w:p>
     <w:p>
@@ -38123,7 +38411,6 @@
               <w:pStyle w:val="Compact"/>
             </w:pPr>
             <w:r>
-              <w:lastRenderedPageBreak/>
               <w:t>MNG1241</w:t>
             </w:r>
           </w:p>
@@ -38580,6 +38867,7 @@
       <w:bookmarkStart w:id="97" w:name="semestre-5"/>
       <w:bookmarkEnd w:id="96"/>
       <w:r>
+        <w:lastRenderedPageBreak/>
         <w:t>Semestre 5</w:t>
       </w:r>
     </w:p>
@@ -39739,14 +40027,14 @@
       <w:pPr>
         <w:pStyle w:val="Titre2"/>
       </w:pPr>
-      <w:bookmarkStart w:id="99" w:name="licence-en-sciences-de-gestion-lsg"/>
-      <w:bookmarkStart w:id="100" w:name="_Toc234848704"/>
-      <w:bookmarkEnd w:id="91"/>
+      <w:bookmarkStart w:id="99" w:name="_Toc234848704"/>
+      <w:bookmarkStart w:id="100" w:name="licence-en-sciences-de-gestion-lsg"/>
+      <w:bookmarkEnd w:id="92"/>
       <w:bookmarkEnd w:id="98"/>
       <w:r>
         <w:t>3.2 LICENCE EN SCIENCES DE GESTION (LSG)</w:t>
       </w:r>
-      <w:bookmarkEnd w:id="100"/>
+      <w:bookmarkEnd w:id="99"/>
     </w:p>
     <w:p>
       <w:pPr>
@@ -40482,7 +40770,6 @@
               <w:pStyle w:val="Compact"/>
             </w:pPr>
             <w:r>
-              <w:lastRenderedPageBreak/>
               <w:t>TEG1351</w:t>
             </w:r>
           </w:p>
@@ -40939,6 +41226,7 @@
       <w:bookmarkStart w:id="104" w:name="semestre-6-1"/>
       <w:bookmarkEnd w:id="103"/>
       <w:r>
+        <w:lastRenderedPageBreak/>
         <w:t>Semestre 6</w:t>
       </w:r>
     </w:p>
@@ -41516,29 +41804,29 @@
     <w:p>
       <w:r>
         <w:pict w14:anchorId="3E5F67F2">
-          <v:rect id="_x0000_i1086" style="width:0;height:1.5pt" o:hralign="center" o:hrstd="t" o:hr="t"/>
+          <v:rect id="_x0000_i1028" style="width:0;height:1.5pt" o:hralign="center" o:hrstd="t" o:hr="t"/>
         </w:pict>
       </w:r>
     </w:p>
     <w:p>
       <w:bookmarkStart w:id="105" w:name="Xc9f3ef495ab016915d9ee995fb429b04b666dc2"/>
       <w:bookmarkStart w:id="106" w:name="master-en-gestion-des-projets-mgpro"/>
-      <w:bookmarkEnd w:id="99"/>
+      <w:bookmarkEnd w:id="100"/>
       <w:bookmarkEnd w:id="104"/>
     </w:p>
     <w:p>
       <w:pPr>
         <w:pStyle w:val="Titre1"/>
       </w:pPr>
-      <w:bookmarkStart w:id="107" w:name="X6884dbfad240a63cc0213fe1d6c01bdc34bb590"/>
-      <w:bookmarkStart w:id="108" w:name="_Toc234848707"/>
-      <w:bookmarkEnd w:id="89"/>
+      <w:bookmarkStart w:id="107" w:name="_Toc234848707"/>
+      <w:bookmarkStart w:id="108" w:name="X6884dbfad240a63cc0213fe1d6c01bdc34bb590"/>
+      <w:bookmarkEnd w:id="90"/>
       <w:bookmarkEnd w:id="105"/>
       <w:bookmarkEnd w:id="106"/>
       <w:r>
         <w:t>4. FACULTÉ SCIENCES DE L’ÉDUCATION ET PSYCHOLOGIE</w:t>
       </w:r>
-      <w:bookmarkEnd w:id="108"/>
+      <w:bookmarkEnd w:id="107"/>
     </w:p>
     <w:p>
       <w:pPr>
@@ -41556,12 +41844,12 @@
       <w:pPr>
         <w:pStyle w:val="Titre2"/>
       </w:pPr>
-      <w:bookmarkStart w:id="109" w:name="licence-en-sciences-psychologiques-sps"/>
-      <w:bookmarkStart w:id="110" w:name="_Toc234848708"/>
+      <w:bookmarkStart w:id="109" w:name="_Toc234848708"/>
+      <w:bookmarkStart w:id="110" w:name="licence-en-sciences-psychologiques-sps"/>
       <w:r>
         <w:t>4.1 LICENCE EN SCIENCES PSYCHOLOGIQUES (SPS)</w:t>
       </w:r>
-      <w:bookmarkEnd w:id="110"/>
+      <w:bookmarkEnd w:id="109"/>
     </w:p>
     <w:p>
       <w:pPr>
@@ -42357,7 +42645,6 @@
               <w:pStyle w:val="Compact"/>
             </w:pPr>
             <w:r>
-              <w:lastRenderedPageBreak/>
               <w:t>PCP1121</w:t>
             </w:r>
           </w:p>
@@ -42863,6 +43150,7 @@
               <w:pStyle w:val="Compact"/>
             </w:pPr>
             <w:r>
+              <w:lastRenderedPageBreak/>
               <w:t>PCP1232</w:t>
             </w:r>
           </w:p>
@@ -44538,7 +44826,6 @@
               <w:pStyle w:val="Compact"/>
             </w:pPr>
             <w:r>
-              <w:lastRenderedPageBreak/>
               <w:t>PST1361</w:t>
             </w:r>
           </w:p>
@@ -44850,14 +45137,15 @@
       <w:pPr>
         <w:pStyle w:val="Titre2"/>
       </w:pPr>
-      <w:bookmarkStart w:id="117" w:name="licence-en-sciences-de-léducation-lsed"/>
-      <w:bookmarkStart w:id="118" w:name="_Toc234848709"/>
-      <w:bookmarkEnd w:id="109"/>
+      <w:bookmarkStart w:id="117" w:name="_Toc234848709"/>
+      <w:bookmarkStart w:id="118" w:name="licence-en-sciences-de-léducation-lsed"/>
+      <w:bookmarkEnd w:id="110"/>
       <w:bookmarkEnd w:id="116"/>
       <w:r>
+        <w:lastRenderedPageBreak/>
         <w:t>4.2 LICENCE EN SCIENCES DE L’ÉDUCATION (LSED)</w:t>
       </w:r>
-      <w:bookmarkEnd w:id="118"/>
+      <w:bookmarkEnd w:id="117"/>
     </w:p>
     <w:p>
       <w:pPr>
@@ -45906,7 +46194,15 @@
               <w:pStyle w:val="Compact"/>
             </w:pPr>
             <w:r>
-              <w:t>Projet tutoré : Construction d’attitudes positives</w:t>
+              <w:t xml:space="preserve">Projet </w:t>
+            </w:r>
+            <w:proofErr w:type="gramStart"/>
+            <w:r>
+              <w:t>tutoré :</w:t>
+            </w:r>
+            <w:proofErr w:type="gramEnd"/>
+            <w:r>
+              <w:t xml:space="preserve"> Construction d’attitudes positives</w:t>
             </w:r>
           </w:p>
         </w:tc>
@@ -45986,7 +46282,15 @@
               <w:pStyle w:val="Compact"/>
             </w:pPr>
             <w:r>
-              <w:t>Stage d’imprégnation : Observation</w:t>
+              <w:t xml:space="preserve">Stage </w:t>
+            </w:r>
+            <w:proofErr w:type="gramStart"/>
+            <w:r>
+              <w:t>d’imprégnation :</w:t>
+            </w:r>
+            <w:proofErr w:type="gramEnd"/>
+            <w:r>
+              <w:t xml:space="preserve"> Observation</w:t>
             </w:r>
           </w:p>
         </w:tc>
@@ -46638,7 +46942,6 @@
               <w:pStyle w:val="Compact"/>
             </w:pPr>
             <w:r>
-              <w:lastRenderedPageBreak/>
               <w:t>PVA1231</w:t>
             </w:r>
           </w:p>
@@ -47077,19 +47380,24 @@
               <w:pStyle w:val="Compact"/>
             </w:pPr>
             <w:r>
-              <w:t>Contexte de l’éducation (Philosophie + Épistémologie)</w:t>
-            </w:r>
-          </w:p>
-        </w:tc>
-        <w:tc>
-          <w:tcPr>
-            <w:tcW w:w="0" w:type="auto"/>
-          </w:tcPr>
-          <w:p>
-            <w:pPr>
-              <w:pStyle w:val="Compact"/>
-            </w:pPr>
-            <w:r>
+              <w:t xml:space="preserve">Contexte de l’éducation (Philosophie + </w:t>
+            </w:r>
+            <w:r>
+              <w:lastRenderedPageBreak/>
+              <w:t>Épistémologie)</w:t>
+            </w:r>
+          </w:p>
+        </w:tc>
+        <w:tc>
+          <w:tcPr>
+            <w:tcW w:w="0" w:type="auto"/>
+          </w:tcPr>
+          <w:p>
+            <w:pPr>
+              <w:pStyle w:val="Compact"/>
+            </w:pPr>
+            <w:r>
+              <w:lastRenderedPageBreak/>
               <w:t>25h</w:t>
             </w:r>
           </w:p>
@@ -47317,7 +47625,15 @@
               <w:pStyle w:val="Compact"/>
             </w:pPr>
             <w:r>
-              <w:t>Projet tutoré : Design pédagogique</w:t>
+              <w:t xml:space="preserve">Projet </w:t>
+            </w:r>
+            <w:proofErr w:type="gramStart"/>
+            <w:r>
+              <w:t>tutoré :</w:t>
+            </w:r>
+            <w:proofErr w:type="gramEnd"/>
+            <w:r>
+              <w:t xml:space="preserve"> Design pédagogique</w:t>
             </w:r>
           </w:p>
         </w:tc>
@@ -48142,7 +48458,15 @@
               <w:pStyle w:val="Compact"/>
             </w:pPr>
             <w:r>
-              <w:t>2 composantes optionnelles (parmi 6 : Orthopédagogie, Andragogie, Administration/planification, Management préscolaire, TICE, Mesure/évaluation)</w:t>
+              <w:t xml:space="preserve">2 composantes optionnelles (parmi </w:t>
+            </w:r>
+            <w:proofErr w:type="gramStart"/>
+            <w:r>
+              <w:t>6 :</w:t>
+            </w:r>
+            <w:proofErr w:type="gramEnd"/>
+            <w:r>
+              <w:t xml:space="preserve"> Orthopédagogie, Andragogie, Administration/planification, Management préscolaire, TICE, Mesure/évaluation)</w:t>
             </w:r>
           </w:p>
         </w:tc>
@@ -48567,7 +48891,15 @@
               <w:pStyle w:val="Compact"/>
             </w:pPr>
             <w:r>
-              <w:t>Projet tutoré : mise en ligne d’un enseignement (+ TFC)</w:t>
+              <w:t xml:space="preserve">Projet </w:t>
+            </w:r>
+            <w:proofErr w:type="gramStart"/>
+            <w:r>
+              <w:t>tutoré :</w:t>
+            </w:r>
+            <w:proofErr w:type="gramEnd"/>
+            <w:r>
+              <w:t xml:space="preserve"> mise en ligne d’un enseignement (+ TFC)</w:t>
             </w:r>
           </w:p>
         </w:tc>
@@ -48780,8 +49112,8 @@
           </w:p>
         </w:tc>
       </w:tr>
-      <w:bookmarkEnd w:id="107"/>
-      <w:bookmarkEnd w:id="117"/>
+      <w:bookmarkEnd w:id="108"/>
+      <w:bookmarkEnd w:id="118"/>
       <w:bookmarkEnd w:id="124"/>
     </w:tbl>
     <w:p>
@@ -48791,7 +49123,7 @@
     </w:p>
     <w:sectPr>
       <w:pgSz w:w="12240" w:h="15840"/>
-      <w:pgMar w:top="426" w:right="1417" w:bottom="567" w:left="1417" w:header="720" w:footer="720" w:gutter="0"/>
+      <w:pgMar w:top="426" w:right="1417" w:bottom="426" w:left="1417" w:header="720" w:footer="720" w:gutter="0"/>
       <w:cols w:space="720"/>
     </w:sectPr>
   </w:body>

</xml_diff>